<commit_message>
feat: colour Python keywords orange in lesson code
Keywords (if, elif, else, for, while, def, return, and/or/not/in,
True/False) now use a PyCharm-style orange (#C45E00) in slides and
worksheets, separate from the blue used for calls and types. Rebuilt all
lessons and capstones.

Co-Authored-By: Claude Opus 5.5 <noreply@anthropic.com>
</commit_message>
<xml_diff>
--- a/Mapped Curriculum Lesson - Supplemental Material/Grade 6/Lesson 04 - Decisions/Decisions - Worksheet.docx
+++ b/Mapped Curriculum Lesson - Supplemental Material/Grade 6/Lesson 04 - Decisions/Decisions - Worksheet.docx
@@ -90,36 +90,90 @@
           <w:rFonts w:ascii="JetBrains Mono" w:hAnsi="JetBrains Mono" w:cs="JetBrains Mono"/>
           <w:sz w:val="24"/>
           <w:szCs w:val="24"/>
+          <w:color w:val="C45E00"/>
+        </w:rPr>
+        <w:t>if</w:t>
+      </w:r>
+      <w:r>
+        <w:rPr>
+          <w:rFonts w:ascii="JetBrains Mono" w:hAnsi="JetBrains Mono" w:cs="JetBrains Mono"/>
+          <w:sz w:val="24"/>
+          <w:szCs w:val="24"/>
+          <w:color w:val="080808"/>
+        </w:rPr>
+        <w:t xml:space="preserve"> choice </w:t>
+      </w:r>
+      <w:r>
+        <w:rPr>
+          <w:rFonts w:ascii="Consolas" w:hAnsi="Consolas" w:cs="JetBrains Mono"/>
+          <w:sz w:val="24"/>
+          <w:szCs w:val="24"/>
+          <w:color w:val="080808"/>
+        </w:rPr>
+        <w:t>==</w:t>
+      </w:r>
+      <w:r>
+        <w:rPr>
+          <w:rFonts w:ascii="JetBrains Mono" w:hAnsi="JetBrains Mono" w:cs="JetBrains Mono"/>
+          <w:sz w:val="24"/>
+          <w:szCs w:val="24"/>
+          <w:color w:val="080808"/>
+        </w:rPr>
+        <w:t xml:space="preserve"> </w:t>
+      </w:r>
+      <w:r>
+        <w:rPr>
+          <w:rFonts w:ascii="JetBrains Mono" w:hAnsi="JetBrains Mono" w:cs="JetBrains Mono"/>
+          <w:sz w:val="24"/>
+          <w:szCs w:val="24"/>
+          <w:color w:val="067D17"/>
+        </w:rPr>
+        <w:t>"walk"</w:t>
+      </w:r>
+      <w:r>
+        <w:rPr>
+          <w:rFonts w:ascii="JetBrains Mono" w:hAnsi="JetBrains Mono" w:cs="JetBrains Mono"/>
+          <w:sz w:val="24"/>
+          <w:szCs w:val="24"/>
+          <w:color w:val="080808"/>
+        </w:rPr>
+        <w:t>:</w:t>
+      </w:r>
+      <w:r>
+        <w:rPr>
+          <w:rFonts w:ascii="JetBrains Mono" w:hAnsi="JetBrains Mono" w:cs="JetBrains Mono"/>
+          <w:sz w:val="24"/>
+          <w:szCs w:val="24"/>
+          <w:color w:val="080808"/>
+        </w:rPr>
+        <w:br/>
+      </w:r>
+      <w:r>
+        <w:rPr>
+          <w:rFonts w:ascii="JetBrains Mono" w:hAnsi="JetBrains Mono" w:cs="JetBrains Mono"/>
+          <w:sz w:val="24"/>
+          <w:szCs w:val="24"/>
+          <w:color w:val="080808"/>
+        </w:rPr>
+        <w:t xml:space="preserve">    </w:t>
+      </w:r>
+      <w:r>
+        <w:rPr>
+          <w:rFonts w:ascii="JetBrains Mono" w:hAnsi="JetBrains Mono" w:cs="JetBrains Mono"/>
+          <w:sz w:val="24"/>
+          <w:szCs w:val="24"/>
           <w:color w:val="1750EB"/>
         </w:rPr>
-        <w:t>if</w:t>
-      </w:r>
-      <w:r>
-        <w:rPr>
-          <w:rFonts w:ascii="JetBrains Mono" w:hAnsi="JetBrains Mono" w:cs="JetBrains Mono"/>
-          <w:sz w:val="24"/>
-          <w:szCs w:val="24"/>
-          <w:color w:val="080808"/>
-        </w:rPr>
-        <w:t xml:space="preserve"> choice </w:t>
-      </w:r>
-      <w:r>
-        <w:rPr>
-          <w:rFonts w:ascii="Consolas" w:hAnsi="Consolas" w:cs="JetBrains Mono"/>
-          <w:sz w:val="24"/>
-          <w:szCs w:val="24"/>
-          <w:color w:val="080808"/>
-        </w:rPr>
-        <w:t>==</w:t>
-      </w:r>
-      <w:r>
-        <w:rPr>
-          <w:rFonts w:ascii="JetBrains Mono" w:hAnsi="JetBrains Mono" w:cs="JetBrains Mono"/>
-          <w:sz w:val="24"/>
-          <w:szCs w:val="24"/>
-          <w:color w:val="080808"/>
-        </w:rPr>
-        <w:t xml:space="preserve"> </w:t>
+        <w:t>print</w:t>
+      </w:r>
+      <w:r>
+        <w:rPr>
+          <w:rFonts w:ascii="JetBrains Mono" w:hAnsi="JetBrains Mono" w:cs="JetBrains Mono"/>
+          <w:sz w:val="24"/>
+          <w:szCs w:val="24"/>
+          <w:color w:val="080808"/>
+        </w:rPr>
+        <w:t>(</w:t>
       </w:r>
       <w:r>
         <w:rPr>
@@ -128,16 +182,16 @@
           <w:szCs w:val="24"/>
           <w:color w:val="067D17"/>
         </w:rPr>
-        <w:t>"walk"</w:t>
-      </w:r>
-      <w:r>
-        <w:rPr>
-          <w:rFonts w:ascii="JetBrains Mono" w:hAnsi="JetBrains Mono" w:cs="JetBrains Mono"/>
-          <w:sz w:val="24"/>
-          <w:szCs w:val="24"/>
-          <w:color w:val="080808"/>
-        </w:rPr>
-        <w:t>:</w:t>
+        <w:t>"Take a walk in the park."</w:t>
+      </w:r>
+      <w:r>
+        <w:rPr>
+          <w:rFonts w:ascii="JetBrains Mono" w:hAnsi="JetBrains Mono" w:cs="JetBrains Mono"/>
+          <w:sz w:val="24"/>
+          <w:szCs w:val="24"/>
+          <w:color w:val="080808"/>
+        </w:rPr>
+        <w:t>)</w:t>
       </w:r>
       <w:r>
         <w:rPr>
@@ -153,61 +207,7 @@
           <w:rFonts w:ascii="JetBrains Mono" w:hAnsi="JetBrains Mono" w:cs="JetBrains Mono"/>
           <w:sz w:val="24"/>
           <w:szCs w:val="24"/>
-          <w:color w:val="080808"/>
-        </w:rPr>
-        <w:t xml:space="preserve">    </w:t>
-      </w:r>
-      <w:r>
-        <w:rPr>
-          <w:rFonts w:ascii="JetBrains Mono" w:hAnsi="JetBrains Mono" w:cs="JetBrains Mono"/>
-          <w:sz w:val="24"/>
-          <w:szCs w:val="24"/>
-          <w:color w:val="1750EB"/>
-        </w:rPr>
-        <w:t>print</w:t>
-      </w:r>
-      <w:r>
-        <w:rPr>
-          <w:rFonts w:ascii="JetBrains Mono" w:hAnsi="JetBrains Mono" w:cs="JetBrains Mono"/>
-          <w:sz w:val="24"/>
-          <w:szCs w:val="24"/>
-          <w:color w:val="080808"/>
-        </w:rPr>
-        <w:t>(</w:t>
-      </w:r>
-      <w:r>
-        <w:rPr>
-          <w:rFonts w:ascii="JetBrains Mono" w:hAnsi="JetBrains Mono" w:cs="JetBrains Mono"/>
-          <w:sz w:val="24"/>
-          <w:szCs w:val="24"/>
-          <w:color w:val="067D17"/>
-        </w:rPr>
-        <w:t>"Take a walk in the park."</w:t>
-      </w:r>
-      <w:r>
-        <w:rPr>
-          <w:rFonts w:ascii="JetBrains Mono" w:hAnsi="JetBrains Mono" w:cs="JetBrains Mono"/>
-          <w:sz w:val="24"/>
-          <w:szCs w:val="24"/>
-          <w:color w:val="080808"/>
-        </w:rPr>
-        <w:t>)</w:t>
-      </w:r>
-      <w:r>
-        <w:rPr>
-          <w:rFonts w:ascii="JetBrains Mono" w:hAnsi="JetBrains Mono" w:cs="JetBrains Mono"/>
-          <w:sz w:val="24"/>
-          <w:szCs w:val="24"/>
-          <w:color w:val="080808"/>
-        </w:rPr>
-        <w:br/>
-      </w:r>
-      <w:r>
-        <w:rPr>
-          <w:rFonts w:ascii="JetBrains Mono" w:hAnsi="JetBrains Mono" w:cs="JetBrains Mono"/>
-          <w:sz w:val="24"/>
-          <w:szCs w:val="24"/>
-          <w:color w:val="1750EB"/>
+          <w:color w:val="C45E00"/>
         </w:rPr>
         <w:t>else</w:t>
       </w:r>
@@ -730,36 +730,99 @@
           <w:rFonts w:ascii="JetBrains Mono" w:hAnsi="JetBrains Mono" w:cs="JetBrains Mono"/>
           <w:sz w:val="24"/>
           <w:szCs w:val="24"/>
+          <w:color w:val="C45E00"/>
+        </w:rPr>
+        <w:t>if</w:t>
+      </w:r>
+      <w:r>
+        <w:rPr>
+          <w:rFonts w:ascii="JetBrains Mono" w:hAnsi="JetBrains Mono" w:cs="JetBrains Mono"/>
+          <w:sz w:val="24"/>
+          <w:szCs w:val="24"/>
+          <w:color w:val="080808"/>
+        </w:rPr>
+        <w:t xml:space="preserve"> choice </w:t>
+      </w:r>
+      <w:r>
+        <w:rPr>
+          <w:rFonts w:ascii="Consolas" w:hAnsi="Consolas" w:cs="JetBrains Mono"/>
+          <w:sz w:val="24"/>
+          <w:szCs w:val="24"/>
+          <w:color w:val="080808"/>
+        </w:rPr>
+        <w:t>==</w:t>
+      </w:r>
+      <w:r>
+        <w:rPr>
+          <w:rFonts w:ascii="JetBrains Mono" w:hAnsi="JetBrains Mono" w:cs="JetBrains Mono"/>
+          <w:sz w:val="24"/>
+          <w:szCs w:val="24"/>
+          <w:color w:val="080808"/>
+        </w:rPr>
+        <w:t xml:space="preserve"> </w:t>
+      </w:r>
+      <w:r>
+        <w:rPr>
+          <w:rFonts w:ascii="JetBrains Mono" w:hAnsi="JetBrains Mono" w:cs="JetBrains Mono"/>
+          <w:sz w:val="24"/>
+          <w:szCs w:val="24"/>
+          <w:color w:val="067D17"/>
+        </w:rPr>
+        <w:t>"walk"</w:t>
+      </w:r>
+      <w:r>
+        <w:rPr>
+          <w:rFonts w:ascii="JetBrains Mono" w:hAnsi="JetBrains Mono" w:cs="JetBrains Mono"/>
+          <w:sz w:val="24"/>
+          <w:szCs w:val="24"/>
+          <w:color w:val="080808"/>
+        </w:rPr>
+        <w:t>:</w:t>
+      </w:r>
+      <w:r>
+        <w:rPr>
+          <w:rFonts w:ascii="JetBrains Mono" w:hAnsi="JetBrains Mono" w:cs="JetBrains Mono"/>
+          <w:sz w:val="24"/>
+          <w:szCs w:val="24"/>
+          <w:color w:val="080808"/>
+        </w:rPr>
+        <w:br/>
+      </w:r>
+      <w:r>
+        <w:rPr>
+          <w:rFonts w:ascii="JetBrains Mono" w:hAnsi="JetBrains Mono" w:cs="JetBrains Mono"/>
+          <w:sz w:val="24"/>
+          <w:szCs w:val="24"/>
+          <w:color w:val="080808"/>
+        </w:rPr>
+        <w:br/>
+      </w:r>
+      <w:r>
+        <w:rPr>
+          <w:rFonts w:ascii="JetBrains Mono" w:hAnsi="JetBrains Mono" w:cs="JetBrains Mono"/>
+          <w:sz w:val="24"/>
+          <w:szCs w:val="24"/>
+          <w:color w:val="080808"/>
+        </w:rPr>
+        <w:t xml:space="preserve">    </w:t>
+      </w:r>
+      <w:r>
+        <w:rPr>
+          <w:rFonts w:ascii="JetBrains Mono" w:hAnsi="JetBrains Mono" w:cs="JetBrains Mono"/>
+          <w:sz w:val="24"/>
+          <w:szCs w:val="24"/>
           <w:color w:val="1750EB"/>
         </w:rPr>
-        <w:t>if</w:t>
-      </w:r>
-      <w:r>
-        <w:rPr>
-          <w:rFonts w:ascii="JetBrains Mono" w:hAnsi="JetBrains Mono" w:cs="JetBrains Mono"/>
-          <w:sz w:val="24"/>
-          <w:szCs w:val="24"/>
-          <w:color w:val="080808"/>
-        </w:rPr>
-        <w:t xml:space="preserve"> choice </w:t>
-      </w:r>
-      <w:r>
-        <w:rPr>
-          <w:rFonts w:ascii="Consolas" w:hAnsi="Consolas" w:cs="JetBrains Mono"/>
-          <w:sz w:val="24"/>
-          <w:szCs w:val="24"/>
-          <w:color w:val="080808"/>
-        </w:rPr>
-        <w:t>==</w:t>
-      </w:r>
-      <w:r>
-        <w:rPr>
-          <w:rFonts w:ascii="JetBrains Mono" w:hAnsi="JetBrains Mono" w:cs="JetBrains Mono"/>
-          <w:sz w:val="24"/>
-          <w:szCs w:val="24"/>
-          <w:color w:val="080808"/>
-        </w:rPr>
-        <w:t xml:space="preserve"> </w:t>
+        <w:t>print</w:t>
+      </w:r>
+      <w:r>
+        <w:rPr>
+          <w:rFonts w:ascii="JetBrains Mono" w:hAnsi="JetBrains Mono" w:cs="JetBrains Mono"/>
+          <w:sz w:val="24"/>
+          <w:szCs w:val="24"/>
+          <w:color w:val="080808"/>
+        </w:rPr>
+        <w:t>(</w:t>
       </w:r>
       <w:r>
         <w:rPr>
@@ -768,16 +831,16 @@
           <w:szCs w:val="24"/>
           <w:color w:val="067D17"/>
         </w:rPr>
-        <w:t>"walk"</w:t>
-      </w:r>
-      <w:r>
-        <w:rPr>
-          <w:rFonts w:ascii="JetBrains Mono" w:hAnsi="JetBrains Mono" w:cs="JetBrains Mono"/>
-          <w:sz w:val="24"/>
-          <w:szCs w:val="24"/>
-          <w:color w:val="080808"/>
-        </w:rPr>
-        <w:t>:</w:t>
+        <w:t>"Take a walk in the park."</w:t>
+      </w:r>
+      <w:r>
+        <w:rPr>
+          <w:rFonts w:ascii="JetBrains Mono" w:hAnsi="JetBrains Mono" w:cs="JetBrains Mono"/>
+          <w:sz w:val="24"/>
+          <w:szCs w:val="24"/>
+          <w:color w:val="080808"/>
+        </w:rPr>
+        <w:t>)</w:t>
       </w:r>
       <w:r>
         <w:rPr>
@@ -793,70 +856,7 @@
           <w:rFonts w:ascii="JetBrains Mono" w:hAnsi="JetBrains Mono" w:cs="JetBrains Mono"/>
           <w:sz w:val="24"/>
           <w:szCs w:val="24"/>
-          <w:color w:val="080808"/>
-        </w:rPr>
-        <w:br/>
-      </w:r>
-      <w:r>
-        <w:rPr>
-          <w:rFonts w:ascii="JetBrains Mono" w:hAnsi="JetBrains Mono" w:cs="JetBrains Mono"/>
-          <w:sz w:val="24"/>
-          <w:szCs w:val="24"/>
-          <w:color w:val="080808"/>
-        </w:rPr>
-        <w:t xml:space="preserve">    </w:t>
-      </w:r>
-      <w:r>
-        <w:rPr>
-          <w:rFonts w:ascii="JetBrains Mono" w:hAnsi="JetBrains Mono" w:cs="JetBrains Mono"/>
-          <w:sz w:val="24"/>
-          <w:szCs w:val="24"/>
-          <w:color w:val="1750EB"/>
-        </w:rPr>
-        <w:t>print</w:t>
-      </w:r>
-      <w:r>
-        <w:rPr>
-          <w:rFonts w:ascii="JetBrains Mono" w:hAnsi="JetBrains Mono" w:cs="JetBrains Mono"/>
-          <w:sz w:val="24"/>
-          <w:szCs w:val="24"/>
-          <w:color w:val="080808"/>
-        </w:rPr>
-        <w:t>(</w:t>
-      </w:r>
-      <w:r>
-        <w:rPr>
-          <w:rFonts w:ascii="JetBrains Mono" w:hAnsi="JetBrains Mono" w:cs="JetBrains Mono"/>
-          <w:sz w:val="24"/>
-          <w:szCs w:val="24"/>
-          <w:color w:val="067D17"/>
-        </w:rPr>
-        <w:t>"Take a walk in the park."</w:t>
-      </w:r>
-      <w:r>
-        <w:rPr>
-          <w:rFonts w:ascii="JetBrains Mono" w:hAnsi="JetBrains Mono" w:cs="JetBrains Mono"/>
-          <w:sz w:val="24"/>
-          <w:szCs w:val="24"/>
-          <w:color w:val="080808"/>
-        </w:rPr>
-        <w:t>)</w:t>
-      </w:r>
-      <w:r>
-        <w:rPr>
-          <w:rFonts w:ascii="JetBrains Mono" w:hAnsi="JetBrains Mono" w:cs="JetBrains Mono"/>
-          <w:sz w:val="24"/>
-          <w:szCs w:val="24"/>
-          <w:color w:val="080808"/>
-        </w:rPr>
-        <w:br/>
-      </w:r>
-      <w:r>
-        <w:rPr>
-          <w:rFonts w:ascii="JetBrains Mono" w:hAnsi="JetBrains Mono" w:cs="JetBrains Mono"/>
-          <w:sz w:val="24"/>
-          <w:szCs w:val="24"/>
-          <w:color w:val="1750EB"/>
+          <w:color w:val="C45E00"/>
         </w:rPr>
         <w:t>else</w:t>
       </w:r>
@@ -981,7 +981,7 @@
       </w:r>
       <w:r>
         <w:rPr>
-          <w:color w:val="1750EB"/>
+          <w:color w:val="C45E00"/>
           <w:rFonts w:ascii="JetBrains Mono" w:hAnsi="JetBrains Mono"/>
           <w:sz w:val="20"/>
           <w:szCs w:val="20"/>
@@ -1276,7 +1276,7 @@
       </w:r>
       <w:r>
         <w:rPr>
-          <w:color w:val="1750EB"/>
+          <w:color w:val="C45E00"/>
           <w:rFonts w:ascii="JetBrains Mono" w:hAnsi="JetBrains Mono"/>
           <w:sz w:val="20"/>
           <w:szCs w:val="20"/>

</xml_diff>